<commit_message>
fix(a11y): Lighthouse Accessibility 100/100 (viewport + heading order)
</commit_message>
<xml_diff>
--- a/docs/testes/avaliacao-heuristica/Relatorio_Avaliacao_Heuristica_Laise_Costa.docx
+++ b/docs/testes/avaliacao-heuristica/Relatorio_Avaliacao_Heuristica_Laise_Costa.docx
@@ -2202,6 +2202,7 @@
         <w:pStyle w:val="Normal"/>
         <w:spacing w:line="360" w:lineRule="auto"/>
         <w:ind w:left="0"/>
+        <w:jc w:val="left"/>
       </w:pPr>
       <w:r>
         <w:rPr>
@@ -2255,6 +2256,43 @@
           </wp:inline>
         </w:drawing>
       </w:r>
+      <w:r>
+        <w:br/>
+      </w:r>
+      <w:r>
+        <w:drawing>
+          <wp:inline>
+            <wp:extent cx="2103120" cy="4551367"/>
+            <wp:docPr id="2127632293" name="Picture 2127632293"/>
+            <wp:cNvGraphicFramePr>
+              <a:graphicFrameLocks noChangeAspect="1"/>
+            </wp:cNvGraphicFramePr>
+            <a:graphic>
+              <a:graphicData uri="http://schemas.openxmlformats.org/drawingml/2006/picture">
+                <pic:pic>
+                  <pic:nvPicPr>
+                    <pic:cNvPr id="0" name="triagem.png"/>
+                    <pic:cNvPicPr/>
+                  </pic:nvPicPr>
+                  <pic:blipFill>
+                    <a:blip r:embed="rId8"/>
+                    <a:stretch>
+                      <a:fillRect/>
+                    </a:stretch>
+                  </pic:blipFill>
+                  <pic:spPr>
+                    <a:xfrm>
+                      <a:off x="0" y="0"/>
+                      <a:ext cx="2103120" cy="4551367"/>
+                    </a:xfrm>
+                    <a:prstGeom prst="rect"/>
+                  </pic:spPr>
+                </pic:pic>
+              </a:graphicData>
+            </a:graphic>
+          </wp:inline>
+        </w:drawing>
+      </w:r>
     </w:p>
     <w:tbl>
       <w:tblPr>
@@ -3788,6 +3826,7 @@
         <w:pStyle w:val="Normal"/>
         <w:spacing w:line="360" w:lineRule="auto"/>
         <w:ind w:left="0"/>
+        <w:jc w:val="left"/>
         <w:rPr>
           <w:rFonts w:ascii="Times New Roman" w:hAnsi="Times New Roman" w:eastAsia="Times New Roman" w:cs="Times New Roman"/>
         </w:rPr>
@@ -3797,6 +3836,43 @@
           <w:rFonts w:ascii="Times New Roman" w:hAnsi="Times New Roman" w:eastAsia="Times New Roman" w:cs="Times New Roman"/>
         </w:rPr>
         <w:t>Evidência:</w:t>
+      </w:r>
+      <w:r>
+        <w:br/>
+      </w:r>
+      <w:r>
+        <w:drawing>
+          <wp:inline>
+            <wp:extent cx="2103120" cy="4551367"/>
+            <wp:docPr id="2127632294" name="Picture 2127632294"/>
+            <wp:cNvGraphicFramePr>
+              <a:graphicFrameLocks noChangeAspect="1"/>
+            </wp:cNvGraphicFramePr>
+            <a:graphic>
+              <a:graphicData uri="http://schemas.openxmlformats.org/drawingml/2006/picture">
+                <pic:pic>
+                  <pic:nvPicPr>
+                    <pic:cNvPr id="0" name="register.png"/>
+                    <pic:cNvPicPr/>
+                  </pic:nvPicPr>
+                  <pic:blipFill>
+                    <a:blip r:embed="rId9"/>
+                    <a:stretch>
+                      <a:fillRect/>
+                    </a:stretch>
+                  </pic:blipFill>
+                  <pic:spPr>
+                    <a:xfrm>
+                      <a:off x="0" y="0"/>
+                      <a:ext cx="2103120" cy="4551367"/>
+                    </a:xfrm>
+                    <a:prstGeom prst="rect"/>
+                  </pic:spPr>
+                </pic:pic>
+              </a:graphicData>
+            </a:graphic>
+          </wp:inline>
+        </w:drawing>
       </w:r>
     </w:p>
     <w:p>
@@ -5499,6 +5575,7 @@
         <w:pStyle w:val="Normal"/>
         <w:spacing w:line="360" w:lineRule="auto"/>
         <w:ind w:left="0"/>
+        <w:jc w:val="left"/>
         <w:rPr>
           <w:rFonts w:ascii="Times New Roman" w:hAnsi="Times New Roman" w:eastAsia="Times New Roman" w:cs="Times New Roman"/>
         </w:rPr>
@@ -5604,6 +5681,43 @@
           </wp:inline>
         </w:drawing>
       </w:r>
+      <w:r>
+        <w:br/>
+      </w:r>
+      <w:r>
+        <w:drawing>
+          <wp:inline>
+            <wp:extent cx="2103120" cy="4551367"/>
+            <wp:docPr id="2127632295" name="Picture 2127632295"/>
+            <wp:cNvGraphicFramePr>
+              <a:graphicFrameLocks noChangeAspect="1"/>
+            </wp:cNvGraphicFramePr>
+            <a:graphic>
+              <a:graphicData uri="http://schemas.openxmlformats.org/drawingml/2006/picture">
+                <pic:pic>
+                  <pic:nvPicPr>
+                    <pic:cNvPr id="0" name="register.png"/>
+                    <pic:cNvPicPr/>
+                  </pic:nvPicPr>
+                  <pic:blipFill>
+                    <a:blip r:embed="rId9"/>
+                    <a:stretch>
+                      <a:fillRect/>
+                    </a:stretch>
+                  </pic:blipFill>
+                  <pic:spPr>
+                    <a:xfrm>
+                      <a:off x="0" y="0"/>
+                      <a:ext cx="2103120" cy="4551367"/>
+                    </a:xfrm>
+                    <a:prstGeom prst="rect"/>
+                  </pic:spPr>
+                </pic:pic>
+              </a:graphicData>
+            </a:graphic>
+          </wp:inline>
+        </w:drawing>
+      </w:r>
     </w:p>
     <w:p>
       <w:r>
@@ -7181,6 +7295,7 @@
         <w:pStyle w:val="Normal"/>
         <w:spacing w:line="360" w:lineRule="auto"/>
         <w:ind w:left="0"/>
+        <w:jc w:val="left"/>
         <w:rPr>
           <w:rFonts w:ascii="Times New Roman" w:hAnsi="Times New Roman" w:eastAsia="Times New Roman" w:cs="Times New Roman"/>
         </w:rPr>
@@ -7246,6 +7361,43 @@
       <w:r>
         <w:br/>
       </w:r>
+      <w:r>
+        <w:br/>
+      </w:r>
+      <w:r>
+        <w:drawing>
+          <wp:inline>
+            <wp:extent cx="2103120" cy="4551367"/>
+            <wp:docPr id="2127632296" name="Picture 2127632296"/>
+            <wp:cNvGraphicFramePr>
+              <a:graphicFrameLocks noChangeAspect="1"/>
+            </wp:cNvGraphicFramePr>
+            <a:graphic>
+              <a:graphicData uri="http://schemas.openxmlformats.org/drawingml/2006/picture">
+                <pic:pic>
+                  <pic:nvPicPr>
+                    <pic:cNvPr id="0" name="simulacao.png"/>
+                    <pic:cNvPicPr/>
+                  </pic:nvPicPr>
+                  <pic:blipFill>
+                    <a:blip r:embed="rId10"/>
+                    <a:stretch>
+                      <a:fillRect/>
+                    </a:stretch>
+                  </pic:blipFill>
+                  <pic:spPr>
+                    <a:xfrm>
+                      <a:off x="0" y="0"/>
+                      <a:ext cx="2103120" cy="4551367"/>
+                    </a:xfrm>
+                    <a:prstGeom prst="rect"/>
+                  </pic:spPr>
+                </pic:pic>
+              </a:graphicData>
+            </a:graphic>
+          </wp:inline>
+        </w:drawing>
+      </w:r>
     </w:p>
     <w:p>
       <w:pPr>
@@ -8780,6 +8932,7 @@
         <w:pStyle w:val="Normal"/>
         <w:spacing w:line="360" w:lineRule="auto"/>
         <w:ind w:left="0"/>
+        <w:jc w:val="left"/>
       </w:pPr>
       <w:r>
         <w:rPr>
@@ -8836,6 +8989,43 @@
       <w:r>
         <w:br/>
       </w:r>
+      <w:r>
+        <w:br/>
+      </w:r>
+      <w:r>
+        <w:drawing>
+          <wp:inline>
+            <wp:extent cx="2103120" cy="4551367"/>
+            <wp:docPr id="2127632297" name="Picture 2127632297"/>
+            <wp:cNvGraphicFramePr>
+              <a:graphicFrameLocks noChangeAspect="1"/>
+            </wp:cNvGraphicFramePr>
+            <a:graphic>
+              <a:graphicData uri="http://schemas.openxmlformats.org/drawingml/2006/picture">
+                <pic:pic>
+                  <pic:nvPicPr>
+                    <pic:cNvPr id="0" name="adicionar.png"/>
+                    <pic:cNvPicPr/>
+                  </pic:nvPicPr>
+                  <pic:blipFill>
+                    <a:blip r:embed="rId11"/>
+                    <a:stretch>
+                      <a:fillRect/>
+                    </a:stretch>
+                  </pic:blipFill>
+                  <pic:spPr>
+                    <a:xfrm>
+                      <a:off x="0" y="0"/>
+                      <a:ext cx="2103120" cy="4551367"/>
+                    </a:xfrm>
+                    <a:prstGeom prst="rect"/>
+                  </pic:spPr>
+                </pic:pic>
+              </a:graphicData>
+            </a:graphic>
+          </wp:inline>
+        </w:drawing>
+      </w:r>
     </w:p>
     <w:p>
       <w:pPr>
@@ -10442,6 +10632,43 @@
           <w:rFonts w:ascii="Times New Roman" w:hAnsi="Times New Roman" w:eastAsia="Times New Roman" w:cs="Times New Roman"/>
         </w:rPr>
         <w:t>Evidência:</w:t>
+      </w:r>
+      <w:r>
+        <w:br/>
+      </w:r>
+      <w:r>
+        <w:drawing>
+          <wp:inline>
+            <wp:extent cx="2103120" cy="4551367"/>
+            <wp:docPr id="2127632298" name="Picture 2127632298"/>
+            <wp:cNvGraphicFramePr>
+              <a:graphicFrameLocks noChangeAspect="1"/>
+            </wp:cNvGraphicFramePr>
+            <a:graphic>
+              <a:graphicData uri="http://schemas.openxmlformats.org/drawingml/2006/picture">
+                <pic:pic>
+                  <pic:nvPicPr>
+                    <pic:cNvPr id="0" name="perfil.png"/>
+                    <pic:cNvPicPr/>
+                  </pic:nvPicPr>
+                  <pic:blipFill>
+                    <a:blip r:embed="rId12"/>
+                    <a:stretch>
+                      <a:fillRect/>
+                    </a:stretch>
+                  </pic:blipFill>
+                  <pic:spPr>
+                    <a:xfrm>
+                      <a:off x="0" y="0"/>
+                      <a:ext cx="2103120" cy="4551367"/>
+                    </a:xfrm>
+                    <a:prstGeom prst="rect"/>
+                  </pic:spPr>
+                </pic:pic>
+              </a:graphicData>
+            </a:graphic>
+          </wp:inline>
+        </w:drawing>
       </w:r>
     </w:p>
     <w:p>
@@ -12526,6 +12753,43 @@
       <w:r>
         <w:br/>
       </w:r>
+      <w:r>
+        <w:br/>
+      </w:r>
+      <w:r>
+        <w:drawing>
+          <wp:inline>
+            <wp:extent cx="2103120" cy="4551367"/>
+            <wp:docPr id="2127632299" name="Picture 2127632299"/>
+            <wp:cNvGraphicFramePr>
+              <a:graphicFrameLocks noChangeAspect="1"/>
+            </wp:cNvGraphicFramePr>
+            <a:graphic>
+              <a:graphicData uri="http://schemas.openxmlformats.org/drawingml/2006/picture">
+                <pic:pic>
+                  <pic:nvPicPr>
+                    <pic:cNvPr id="0" name="dashboard.png"/>
+                    <pic:cNvPicPr/>
+                  </pic:nvPicPr>
+                  <pic:blipFill>
+                    <a:blip r:embed="rId15"/>
+                    <a:stretch>
+                      <a:fillRect/>
+                    </a:stretch>
+                  </pic:blipFill>
+                  <pic:spPr>
+                    <a:xfrm>
+                      <a:off x="0" y="0"/>
+                      <a:ext cx="2103120" cy="4551367"/>
+                    </a:xfrm>
+                    <a:prstGeom prst="rect"/>
+                  </pic:spPr>
+                </pic:pic>
+              </a:graphicData>
+            </a:graphic>
+          </wp:inline>
+        </w:drawing>
+      </w:r>
     </w:p>
     <w:p>
       <w:pPr>
@@ -14129,6 +14393,43 @@
       <w:r>
         <w:br/>
       </w:r>
+      <w:r>
+        <w:br/>
+      </w:r>
+      <w:r>
+        <w:drawing>
+          <wp:inline>
+            <wp:extent cx="2103120" cy="4551367"/>
+            <wp:docPr id="2127632300" name="Picture 2127632300"/>
+            <wp:cNvGraphicFramePr>
+              <a:graphicFrameLocks noChangeAspect="1"/>
+            </wp:cNvGraphicFramePr>
+            <a:graphic>
+              <a:graphicData uri="http://schemas.openxmlformats.org/drawingml/2006/picture">
+                <pic:pic>
+                  <pic:nvPicPr>
+                    <pic:cNvPr id="0" name="perfil.png"/>
+                    <pic:cNvPicPr/>
+                  </pic:nvPicPr>
+                  <pic:blipFill>
+                    <a:blip r:embed="rId12"/>
+                    <a:stretch>
+                      <a:fillRect/>
+                    </a:stretch>
+                  </pic:blipFill>
+                  <pic:spPr>
+                    <a:xfrm>
+                      <a:off x="0" y="0"/>
+                      <a:ext cx="2103120" cy="4551367"/>
+                    </a:xfrm>
+                    <a:prstGeom prst="rect"/>
+                  </pic:spPr>
+                </pic:pic>
+              </a:graphicData>
+            </a:graphic>
+          </wp:inline>
+        </w:drawing>
+      </w:r>
     </w:p>
     <w:p>
       <w:r>
@@ -15707,6 +16008,7 @@
       <w:pPr>
         <w:spacing w:line="360" w:lineRule="auto"/>
         <w:ind w:left="0"/>
+        <w:jc w:val="left"/>
         <w:rPr>
           <w:rFonts w:ascii="Times New Roman" w:hAnsi="Times New Roman" w:eastAsia="Times New Roman" w:cs="Times New Roman"/>
           <w:b w:val="0"/>
@@ -15738,6 +16040,43 @@
           <w:lang w:val="pt-BR"/>
         </w:rPr>
         <w:t>Evidência:</w:t>
+      </w:r>
+      <w:r>
+        <w:br/>
+      </w:r>
+      <w:r>
+        <w:drawing>
+          <wp:inline>
+            <wp:extent cx="2103120" cy="4551367"/>
+            <wp:docPr id="2127632301" name="Picture 2127632301"/>
+            <wp:cNvGraphicFramePr>
+              <a:graphicFrameLocks noChangeAspect="1"/>
+            </wp:cNvGraphicFramePr>
+            <a:graphic>
+              <a:graphicData uri="http://schemas.openxmlformats.org/drawingml/2006/picture">
+                <pic:pic>
+                  <pic:nvPicPr>
+                    <pic:cNvPr id="0" name="unidades.png"/>
+                    <pic:cNvPicPr/>
+                  </pic:nvPicPr>
+                  <pic:blipFill>
+                    <a:blip r:embed="rId16"/>
+                    <a:stretch>
+                      <a:fillRect/>
+                    </a:stretch>
+                  </pic:blipFill>
+                  <pic:spPr>
+                    <a:xfrm>
+                      <a:off x="0" y="0"/>
+                      <a:ext cx="2103120" cy="4551367"/>
+                    </a:xfrm>
+                    <a:prstGeom prst="rect"/>
+                  </pic:spPr>
+                </pic:pic>
+              </a:graphicData>
+            </a:graphic>
+          </wp:inline>
+        </w:drawing>
       </w:r>
     </w:p>
     <w:p>
@@ -17411,6 +17750,43 @@
           <w:lang w:val="pt-BR"/>
         </w:rPr>
         <w:t>Evidência:</w:t>
+      </w:r>
+      <w:r>
+        <w:br/>
+      </w:r>
+      <w:r>
+        <w:drawing>
+          <wp:inline>
+            <wp:extent cx="2103120" cy="4551367"/>
+            <wp:docPr id="2127632302" name="Picture 2127632302"/>
+            <wp:cNvGraphicFramePr>
+              <a:graphicFrameLocks noChangeAspect="1"/>
+            </wp:cNvGraphicFramePr>
+            <a:graphic>
+              <a:graphicData uri="http://schemas.openxmlformats.org/drawingml/2006/picture">
+                <pic:pic>
+                  <pic:nvPicPr>
+                    <pic:cNvPr id="0" name="beneficio.png"/>
+                    <pic:cNvPicPr/>
+                  </pic:nvPicPr>
+                  <pic:blipFill>
+                    <a:blip r:embed="rId17"/>
+                    <a:stretch>
+                      <a:fillRect/>
+                    </a:stretch>
+                  </pic:blipFill>
+                  <pic:spPr>
+                    <a:xfrm>
+                      <a:off x="0" y="0"/>
+                      <a:ext cx="2103120" cy="4551367"/>
+                    </a:xfrm>
+                    <a:prstGeom prst="rect"/>
+                  </pic:spPr>
+                </pic:pic>
+              </a:graphicData>
+            </a:graphic>
+          </wp:inline>
+        </w:drawing>
       </w:r>
     </w:p>
     <w:p>

</xml_diff>

<commit_message>
fix(dashboard): corrige layout dos botoes CTA cortando texto
</commit_message>
<xml_diff>
--- a/docs/testes/avaliacao-heuristica/Relatorio_Avaliacao_Heuristica_Laise_Costa.docx
+++ b/docs/testes/avaliacao-heuristica/Relatorio_Avaliacao_Heuristica_Laise_Costa.docx
@@ -2202,7 +2202,6 @@
         <w:pStyle w:val="Normal"/>
         <w:spacing w:line="360" w:lineRule="auto"/>
         <w:ind w:left="0"/>
-        <w:jc w:val="left"/>
       </w:pPr>
       <w:r>
         <w:rPr>
@@ -2214,56 +2213,13 @@
         <w:br/>
       </w:r>
       <w:r>
-        <w:drawing>
-          <wp:inline wp14:editId="631EB23E" wp14:anchorId="1579BC65">
-            <wp:extent cx="5040312" cy="2284942"/>
-            <wp:effectExtent l="0" t="0" r="0" b="0"/>
-            <wp:docPr id="384735993" name="" title=""/>
-            <wp:cNvGraphicFramePr>
-              <a:graphicFrameLocks noChangeAspect="1"/>
-            </wp:cNvGraphicFramePr>
-            <a:graphic>
-              <a:graphicData uri="http://schemas.openxmlformats.org/drawingml/2006/picture">
-                <pic:pic>
-                  <pic:nvPicPr>
-                    <pic:cNvPr id="0" name=""/>
-                    <pic:cNvPicPr/>
-                  </pic:nvPicPr>
-                  <pic:blipFill>
-                    <a:blip r:embed="Ra3e472d470224c57">
-                      <a:extLst>
-                        <a:ext xmlns:a="http://schemas.openxmlformats.org/drawingml/2006/main" uri="{28A0092B-C50C-407E-A947-70E740481C1C}">
-                          <a14:useLocalDpi val="0"/>
-                        </a:ext>
-                      </a:extLst>
-                    </a:blip>
-                    <a:stretch>
-                      <a:fillRect/>
-                    </a:stretch>
-                  </pic:blipFill>
-                  <pic:spPr>
-                    <a:xfrm>
-                      <a:off x="0" y="0"/>
-                      <a:ext cx="5040312" cy="2284942"/>
-                    </a:xfrm>
-                    <a:prstGeom prst="rect">
-                      <a:avLst/>
-                    </a:prstGeom>
-                  </pic:spPr>
-                </pic:pic>
-              </a:graphicData>
-            </a:graphic>
-          </wp:inline>
-        </w:drawing>
-      </w:r>
-      <w:r>
         <w:br/>
       </w:r>
       <w:r>
         <w:drawing>
           <wp:inline>
             <wp:extent cx="2103120" cy="4551367"/>
-            <wp:docPr id="2127632293" name="Picture 2127632293"/>
+            <wp:docPr id="1" name="Picture 1"/>
             <wp:cNvGraphicFramePr>
               <a:graphicFrameLocks noChangeAspect="1"/>
             </wp:cNvGraphicFramePr>
@@ -3826,7 +3782,6 @@
         <w:pStyle w:val="Normal"/>
         <w:spacing w:line="360" w:lineRule="auto"/>
         <w:ind w:left="0"/>
-        <w:jc w:val="left"/>
         <w:rPr>
           <w:rFonts w:ascii="Times New Roman" w:hAnsi="Times New Roman" w:eastAsia="Times New Roman" w:cs="Times New Roman"/>
         </w:rPr>
@@ -3844,7 +3799,7 @@
         <w:drawing>
           <wp:inline>
             <wp:extent cx="2103120" cy="4551367"/>
-            <wp:docPr id="2127632294" name="Picture 2127632294"/>
+            <wp:docPr id="2" name="Picture 2"/>
             <wp:cNvGraphicFramePr>
               <a:graphicFrameLocks noChangeAspect="1"/>
             </wp:cNvGraphicFramePr>
@@ -3880,140 +3835,11 @@
         <w:spacing w:line="360" w:lineRule="auto"/>
         <w:ind w:left="0"/>
       </w:pPr>
-      <w:r>
-        <w:drawing>
-          <wp:inline wp14:editId="74F91625" wp14:anchorId="12C41B6D">
-            <wp:extent cx="2224278" cy="2000250"/>
-            <wp:effectExtent l="0" t="0" r="0" b="0"/>
-            <wp:docPr id="1745168119" name="" descr="Imagem" title=""/>
-            <wp:cNvGraphicFramePr>
-              <a:graphicFrameLocks noChangeAspect="1"/>
-            </wp:cNvGraphicFramePr>
-            <a:graphic>
-              <a:graphicData uri="http://schemas.openxmlformats.org/drawingml/2006/picture">
-                <pic:pic>
-                  <pic:nvPicPr>
-                    <pic:cNvPr id="0" name=""/>
-                    <pic:cNvPicPr/>
-                  </pic:nvPicPr>
-                  <pic:blipFill>
-                    <a:blip r:embed="R9a3e20d2111f48d2">
-                      <a:extLst>
-                        <a:ext xmlns:a="http://schemas.openxmlformats.org/drawingml/2006/main" uri="{28A0092B-C50C-407E-A947-70E740481C1C}">
-                          <a14:useLocalDpi val="0"/>
-                        </a:ext>
-                      </a:extLst>
-                    </a:blip>
-                    <a:stretch>
-                      <a:fillRect/>
-                    </a:stretch>
-                  </pic:blipFill>
-                  <pic:spPr>
-                    <a:xfrm>
-                      <a:off x="0" y="0"/>
-                      <a:ext cx="2224278" cy="2000250"/>
-                    </a:xfrm>
-                    <a:prstGeom prst="rect">
-                      <a:avLst/>
-                    </a:prstGeom>
-                  </pic:spPr>
-                </pic:pic>
-              </a:graphicData>
-            </a:graphic>
-          </wp:inline>
-        </w:drawing>
-      </w:r>
-      <w:r>
-        <w:drawing>
-          <wp:inline wp14:editId="1C258520" wp14:anchorId="1E5EA907">
-            <wp:extent cx="3599260" cy="1919605"/>
-            <wp:effectExtent l="0" t="0" r="0" b="0"/>
-            <wp:docPr id="1624450825" name="" title=""/>
-            <wp:cNvGraphicFramePr>
-              <a:graphicFrameLocks noChangeAspect="1"/>
-            </wp:cNvGraphicFramePr>
-            <a:graphic>
-              <a:graphicData uri="http://schemas.openxmlformats.org/drawingml/2006/picture">
-                <pic:pic>
-                  <pic:nvPicPr>
-                    <pic:cNvPr id="0" name=""/>
-                    <pic:cNvPicPr/>
-                  </pic:nvPicPr>
-                  <pic:blipFill>
-                    <a:blip r:embed="R1c7a549811314b01">
-                      <a:extLst>
-                        <a:ext xmlns:a="http://schemas.openxmlformats.org/drawingml/2006/main" uri="{28A0092B-C50C-407E-A947-70E740481C1C}">
-                          <a14:useLocalDpi val="0"/>
-                        </a:ext>
-                      </a:extLst>
-                    </a:blip>
-                    <a:stretch>
-                      <a:fillRect/>
-                    </a:stretch>
-                  </pic:blipFill>
-                  <pic:spPr>
-                    <a:xfrm>
-                      <a:off x="0" y="0"/>
-                      <a:ext cx="3599260" cy="1919605"/>
-                    </a:xfrm>
-                    <a:prstGeom prst="rect">
-                      <a:avLst/>
-                    </a:prstGeom>
-                  </pic:spPr>
-                </pic:pic>
-              </a:graphicData>
-            </a:graphic>
-          </wp:inline>
-        </w:drawing>
-      </w:r>
     </w:p>
     <w:p>
       <w:pPr>
         <w:spacing w:line="360" w:lineRule="auto"/>
       </w:pPr>
-      <w:r>
-        <w:drawing>
-          <wp:inline wp14:editId="02CCEA97" wp14:anchorId="5DFC5A43">
-            <wp:extent cx="5058833" cy="2276475"/>
-            <wp:effectExtent l="0" t="0" r="0" b="0"/>
-            <wp:docPr id="386248448" name="" title=""/>
-            <wp:cNvGraphicFramePr>
-              <a:graphicFrameLocks noChangeAspect="1"/>
-            </wp:cNvGraphicFramePr>
-            <a:graphic>
-              <a:graphicData uri="http://schemas.openxmlformats.org/drawingml/2006/picture">
-                <pic:pic>
-                  <pic:nvPicPr>
-                    <pic:cNvPr id="0" name=""/>
-                    <pic:cNvPicPr/>
-                  </pic:nvPicPr>
-                  <pic:blipFill>
-                    <a:blip r:embed="R1f4910ad44bc42f7">
-                      <a:extLst>
-                        <a:ext xmlns:a="http://schemas.openxmlformats.org/drawingml/2006/main" uri="{28A0092B-C50C-407E-A947-70E740481C1C}">
-                          <a14:useLocalDpi val="0"/>
-                        </a:ext>
-                      </a:extLst>
-                    </a:blip>
-                    <a:stretch>
-                      <a:fillRect/>
-                    </a:stretch>
-                  </pic:blipFill>
-                  <pic:spPr>
-                    <a:xfrm>
-                      <a:off x="0" y="0"/>
-                      <a:ext cx="5058833" cy="2276475"/>
-                    </a:xfrm>
-                    <a:prstGeom prst="rect">
-                      <a:avLst/>
-                    </a:prstGeom>
-                  </pic:spPr>
-                </pic:pic>
-              </a:graphicData>
-            </a:graphic>
-          </wp:inline>
-        </w:drawing>
-      </w:r>
       <w:r>
         <w:br/>
       </w:r>
@@ -5575,7 +5401,6 @@
         <w:pStyle w:val="Normal"/>
         <w:spacing w:line="360" w:lineRule="auto"/>
         <w:ind w:left="0"/>
-        <w:jc w:val="left"/>
         <w:rPr>
           <w:rFonts w:ascii="Times New Roman" w:hAnsi="Times New Roman" w:eastAsia="Times New Roman" w:cs="Times New Roman"/>
         </w:rPr>
@@ -5590,47 +5415,7 @@
         <w:br/>
       </w:r>
       <w:r>
-        <w:drawing>
-          <wp:inline wp14:editId="0B0666D7" wp14:anchorId="589146E6">
-            <wp:extent cx="3444254" cy="2390194"/>
-            <wp:effectExtent l="0" t="0" r="0" b="0"/>
-            <wp:docPr id="780260268" name="" descr="Imagem" title=""/>
-            <wp:cNvGraphicFramePr>
-              <a:graphicFrameLocks noChangeAspect="1"/>
-            </wp:cNvGraphicFramePr>
-            <a:graphic>
-              <a:graphicData uri="http://schemas.openxmlformats.org/drawingml/2006/picture">
-                <pic:pic>
-                  <pic:nvPicPr>
-                    <pic:cNvPr id="0" name=""/>
-                    <pic:cNvPicPr/>
-                  </pic:nvPicPr>
-                  <pic:blipFill>
-                    <a:blip r:embed="R24a60b0c7d69419e">
-                      <a:extLst>
-                        <a:ext xmlns:a="http://schemas.openxmlformats.org/drawingml/2006/main" uri="{28A0092B-C50C-407E-A947-70E740481C1C}">
-                          <a14:useLocalDpi val="0"/>
-                        </a:ext>
-                      </a:extLst>
-                    </a:blip>
-                    <a:stretch>
-                      <a:fillRect/>
-                    </a:stretch>
-                  </pic:blipFill>
-                  <pic:spPr>
-                    <a:xfrm>
-                      <a:off x="0" y="0"/>
-                      <a:ext cx="3444254" cy="2390194"/>
-                    </a:xfrm>
-                    <a:prstGeom prst="rect">
-                      <a:avLst/>
-                    </a:prstGeom>
-                  </pic:spPr>
-                </pic:pic>
-              </a:graphicData>
-            </a:graphic>
-          </wp:inline>
-        </w:drawing>
+        <w:br/>
       </w:r>
       <w:r>
         <w:br/>
@@ -5640,55 +5425,9 @@
       </w:r>
       <w:r>
         <w:drawing>
-          <wp:inline wp14:editId="2C4A8B3E" wp14:anchorId="4AD111FC">
-            <wp:extent cx="3468687" cy="2262188"/>
-            <wp:effectExtent l="0" t="0" r="0" b="0"/>
-            <wp:docPr id="2127632292" name="" descr="Imagem" title=""/>
-            <wp:cNvGraphicFramePr>
-              <a:graphicFrameLocks noChangeAspect="1"/>
-            </wp:cNvGraphicFramePr>
-            <a:graphic>
-              <a:graphicData uri="http://schemas.openxmlformats.org/drawingml/2006/picture">
-                <pic:pic>
-                  <pic:nvPicPr>
-                    <pic:cNvPr id="0" name=""/>
-                    <pic:cNvPicPr/>
-                  </pic:nvPicPr>
-                  <pic:blipFill>
-                    <a:blip r:embed="Rc999618812df4f20">
-                      <a:extLst>
-                        <a:ext xmlns:a="http://schemas.openxmlformats.org/drawingml/2006/main" uri="{28A0092B-C50C-407E-A947-70E740481C1C}">
-                          <a14:useLocalDpi val="0"/>
-                        </a:ext>
-                      </a:extLst>
-                    </a:blip>
-                    <a:stretch>
-                      <a:fillRect/>
-                    </a:stretch>
-                  </pic:blipFill>
-                  <pic:spPr>
-                    <a:xfrm>
-                      <a:off x="0" y="0"/>
-                      <a:ext cx="3468687" cy="2262188"/>
-                    </a:xfrm>
-                    <a:prstGeom prst="rect">
-                      <a:avLst/>
-                    </a:prstGeom>
-                  </pic:spPr>
-                </pic:pic>
-              </a:graphicData>
-            </a:graphic>
-          </wp:inline>
-        </w:drawing>
-      </w:r>
-      <w:r>
-        <w:br/>
-      </w:r>
-      <w:r>
-        <w:drawing>
           <wp:inline>
             <wp:extent cx="2103120" cy="4551367"/>
-            <wp:docPr id="2127632295" name="Picture 2127632295"/>
+            <wp:docPr id="3" name="Picture 3"/>
             <wp:cNvGraphicFramePr>
               <a:graphicFrameLocks noChangeAspect="1"/>
             </wp:cNvGraphicFramePr>
@@ -7295,7 +7034,6 @@
         <w:pStyle w:val="Normal"/>
         <w:spacing w:line="360" w:lineRule="auto"/>
         <w:ind w:left="0"/>
-        <w:jc w:val="left"/>
         <w:rPr>
           <w:rFonts w:ascii="Times New Roman" w:hAnsi="Times New Roman" w:eastAsia="Times New Roman" w:cs="Times New Roman"/>
         </w:rPr>
@@ -7311,49 +7049,6 @@
       </w:r>
       <w:r>
         <w:br/>
-      </w:r>
-      <w:r>
-        <w:drawing>
-          <wp:inline wp14:editId="1EC958DB" wp14:anchorId="23E7C192">
-            <wp:extent cx="4610746" cy="3020171"/>
-            <wp:effectExtent l="0" t="0" r="0" b="0"/>
-            <wp:docPr id="1463382079" name="" descr="Imagem" title=""/>
-            <wp:cNvGraphicFramePr>
-              <a:graphicFrameLocks noChangeAspect="1"/>
-            </wp:cNvGraphicFramePr>
-            <a:graphic>
-              <a:graphicData uri="http://schemas.openxmlformats.org/drawingml/2006/picture">
-                <pic:pic>
-                  <pic:nvPicPr>
-                    <pic:cNvPr id="0" name=""/>
-                    <pic:cNvPicPr/>
-                  </pic:nvPicPr>
-                  <pic:blipFill>
-                    <a:blip r:embed="R8bc500dcac934495">
-                      <a:extLst>
-                        <a:ext xmlns:a="http://schemas.openxmlformats.org/drawingml/2006/main" uri="{28A0092B-C50C-407E-A947-70E740481C1C}">
-                          <a14:useLocalDpi val="0"/>
-                        </a:ext>
-                      </a:extLst>
-                    </a:blip>
-                    <a:stretch>
-                      <a:fillRect/>
-                    </a:stretch>
-                  </pic:blipFill>
-                  <pic:spPr>
-                    <a:xfrm>
-                      <a:off x="0" y="0"/>
-                      <a:ext cx="4610746" cy="3020171"/>
-                    </a:xfrm>
-                    <a:prstGeom prst="rect">
-                      <a:avLst/>
-                    </a:prstGeom>
-                  </pic:spPr>
-                </pic:pic>
-              </a:graphicData>
-            </a:graphic>
-          </wp:inline>
-        </w:drawing>
       </w:r>
       <w:r>
         <w:br/>
@@ -7368,7 +7063,7 @@
         <w:drawing>
           <wp:inline>
             <wp:extent cx="2103120" cy="4551367"/>
-            <wp:docPr id="2127632296" name="Picture 2127632296"/>
+            <wp:docPr id="4" name="Picture 4"/>
             <wp:cNvGraphicFramePr>
               <a:graphicFrameLocks noChangeAspect="1"/>
             </wp:cNvGraphicFramePr>
@@ -8932,7 +8627,6 @@
         <w:pStyle w:val="Normal"/>
         <w:spacing w:line="360" w:lineRule="auto"/>
         <w:ind w:left="0"/>
-        <w:jc w:val="left"/>
       </w:pPr>
       <w:r>
         <w:rPr>
@@ -8942,49 +8636,6 @@
       </w:r>
       <w:r>
         <w:br/>
-      </w:r>
-      <w:r>
-        <w:drawing>
-          <wp:inline wp14:editId="0212949F" wp14:anchorId="53725EE1">
-            <wp:extent cx="4538664" cy="2336760"/>
-            <wp:effectExtent l="0" t="0" r="0" b="0"/>
-            <wp:docPr id="795157714" name="" title="Inserindo imagem..."/>
-            <wp:cNvGraphicFramePr>
-              <a:graphicFrameLocks noChangeAspect="1"/>
-            </wp:cNvGraphicFramePr>
-            <a:graphic>
-              <a:graphicData uri="http://schemas.openxmlformats.org/drawingml/2006/picture">
-                <pic:pic>
-                  <pic:nvPicPr>
-                    <pic:cNvPr id="0" name=""/>
-                    <pic:cNvPicPr/>
-                  </pic:nvPicPr>
-                  <pic:blipFill>
-                    <a:blip r:embed="Rdb7a8d94ca2a4d58">
-                      <a:extLst>
-                        <a:ext xmlns:a="http://schemas.openxmlformats.org/drawingml/2006/main" uri="{28A0092B-C50C-407E-A947-70E740481C1C}">
-                          <a14:useLocalDpi val="0"/>
-                        </a:ext>
-                      </a:extLst>
-                    </a:blip>
-                    <a:stretch>
-                      <a:fillRect/>
-                    </a:stretch>
-                  </pic:blipFill>
-                  <pic:spPr>
-                    <a:xfrm>
-                      <a:off x="0" y="0"/>
-                      <a:ext cx="4538664" cy="2336760"/>
-                    </a:xfrm>
-                    <a:prstGeom prst="rect">
-                      <a:avLst/>
-                    </a:prstGeom>
-                  </pic:spPr>
-                </pic:pic>
-              </a:graphicData>
-            </a:graphic>
-          </wp:inline>
-        </w:drawing>
       </w:r>
       <w:r>
         <w:br/>
@@ -8996,7 +8647,7 @@
         <w:drawing>
           <wp:inline>
             <wp:extent cx="2103120" cy="4551367"/>
-            <wp:docPr id="2127632297" name="Picture 2127632297"/>
+            <wp:docPr id="5" name="Picture 5"/>
             <wp:cNvGraphicFramePr>
               <a:graphicFrameLocks noChangeAspect="1"/>
             </wp:cNvGraphicFramePr>
@@ -10640,7 +10291,7 @@
         <w:drawing>
           <wp:inline>
             <wp:extent cx="2103120" cy="4551367"/>
-            <wp:docPr id="2127632298" name="Picture 2127632298"/>
+            <wp:docPr id="6" name="Picture 6"/>
             <wp:cNvGraphicFramePr>
               <a:graphicFrameLocks noChangeAspect="1"/>
             </wp:cNvGraphicFramePr>
@@ -10678,185 +10329,7 @@
         <w:jc w:val="left"/>
       </w:pPr>
       <w:r>
-        <w:drawing>
-          <wp:inline wp14:editId="44F298DC" wp14:anchorId="64C5911B">
-            <wp:extent cx="5715000" cy="2571750"/>
-            <wp:effectExtent l="0" t="0" r="0" b="0"/>
-            <wp:docPr id="2017296436" name="" title=""/>
-            <wp:cNvGraphicFramePr>
-              <a:graphicFrameLocks noChangeAspect="1"/>
-            </wp:cNvGraphicFramePr>
-            <a:graphic>
-              <a:graphicData uri="http://schemas.openxmlformats.org/drawingml/2006/picture">
-                <pic:pic>
-                  <pic:nvPicPr>
-                    <pic:cNvPr id="0" name=""/>
-                    <pic:cNvPicPr/>
-                  </pic:nvPicPr>
-                  <pic:blipFill>
-                    <a:blip r:embed="Re46444fa1e1d49ed">
-                      <a:extLst>
-                        <a:ext xmlns:a="http://schemas.openxmlformats.org/drawingml/2006/main" uri="{28A0092B-C50C-407E-A947-70E740481C1C}">
-                          <a14:useLocalDpi val="0"/>
-                        </a:ext>
-                      </a:extLst>
-                    </a:blip>
-                    <a:stretch>
-                      <a:fillRect/>
-                    </a:stretch>
-                  </pic:blipFill>
-                  <pic:spPr>
-                    <a:xfrm>
-                      <a:off x="0" y="0"/>
-                      <a:ext cx="5715000" cy="2571750"/>
-                    </a:xfrm>
-                    <a:prstGeom prst="rect">
-                      <a:avLst/>
-                    </a:prstGeom>
-                  </pic:spPr>
-                </pic:pic>
-              </a:graphicData>
-            </a:graphic>
-          </wp:inline>
-        </w:drawing>
-      </w:r>
-      <w:r>
         <w:br/>
-      </w:r>
-      <w:r>
-        <w:drawing>
-          <wp:inline wp14:editId="13B6407B" wp14:anchorId="538FF73E">
-            <wp:extent cx="5715000" cy="2571750"/>
-            <wp:effectExtent l="0" t="0" r="0" b="0"/>
-            <wp:docPr id="1203272234" name="" title=""/>
-            <wp:cNvGraphicFramePr>
-              <a:graphicFrameLocks noChangeAspect="1"/>
-            </wp:cNvGraphicFramePr>
-            <a:graphic>
-              <a:graphicData uri="http://schemas.openxmlformats.org/drawingml/2006/picture">
-                <pic:pic>
-                  <pic:nvPicPr>
-                    <pic:cNvPr id="0" name=""/>
-                    <pic:cNvPicPr/>
-                  </pic:nvPicPr>
-                  <pic:blipFill>
-                    <a:blip r:embed="Rdb04ae7b25f84f31">
-                      <a:extLst>
-                        <a:ext xmlns:a="http://schemas.openxmlformats.org/drawingml/2006/main" uri="{28A0092B-C50C-407E-A947-70E740481C1C}">
-                          <a14:useLocalDpi val="0"/>
-                        </a:ext>
-                      </a:extLst>
-                    </a:blip>
-                    <a:stretch>
-                      <a:fillRect/>
-                    </a:stretch>
-                  </pic:blipFill>
-                  <pic:spPr>
-                    <a:xfrm>
-                      <a:off x="0" y="0"/>
-                      <a:ext cx="5715000" cy="2571750"/>
-                    </a:xfrm>
-                    <a:prstGeom prst="rect">
-                      <a:avLst/>
-                    </a:prstGeom>
-                  </pic:spPr>
-                </pic:pic>
-              </a:graphicData>
-            </a:graphic>
-          </wp:inline>
-        </w:drawing>
-      </w:r>
-      <w:r>
-        <w:br/>
-      </w:r>
-      <w:r>
-        <w:drawing>
-          <wp:inline wp14:editId="01C4BE85" wp14:anchorId="7E83EAAB">
-            <wp:extent cx="5715000" cy="2714625"/>
-            <wp:effectExtent l="0" t="0" r="0" b="0"/>
-            <wp:docPr id="2105108432" name="" title=""/>
-            <wp:cNvGraphicFramePr>
-              <a:graphicFrameLocks noChangeAspect="1"/>
-            </wp:cNvGraphicFramePr>
-            <a:graphic>
-              <a:graphicData uri="http://schemas.openxmlformats.org/drawingml/2006/picture">
-                <pic:pic>
-                  <pic:nvPicPr>
-                    <pic:cNvPr id="0" name=""/>
-                    <pic:cNvPicPr/>
-                  </pic:nvPicPr>
-                  <pic:blipFill>
-                    <a:blip r:embed="Rdcd541d0e56e466a">
-                      <a:extLst>
-                        <a:ext xmlns:a="http://schemas.openxmlformats.org/drawingml/2006/main" uri="{28A0092B-C50C-407E-A947-70E740481C1C}">
-                          <a14:useLocalDpi val="0"/>
-                        </a:ext>
-                      </a:extLst>
-                    </a:blip>
-                    <a:stretch>
-                      <a:fillRect/>
-                    </a:stretch>
-                  </pic:blipFill>
-                  <pic:spPr>
-                    <a:xfrm>
-                      <a:off x="0" y="0"/>
-                      <a:ext cx="5715000" cy="2714625"/>
-                    </a:xfrm>
-                    <a:prstGeom prst="rect">
-                      <a:avLst/>
-                    </a:prstGeom>
-                  </pic:spPr>
-                </pic:pic>
-              </a:graphicData>
-            </a:graphic>
-          </wp:inline>
-        </w:drawing>
-      </w:r>
-      <w:r>
-        <w:br/>
-      </w:r>
-      <w:r>
-        <w:drawing>
-          <wp:inline wp14:editId="7E448258" wp14:anchorId="587CC261">
-            <wp:extent cx="5715000" cy="2590800"/>
-            <wp:effectExtent l="0" t="0" r="0" b="0"/>
-            <wp:docPr id="1143055675" name="" title=""/>
-            <wp:cNvGraphicFramePr>
-              <a:graphicFrameLocks noChangeAspect="1"/>
-            </wp:cNvGraphicFramePr>
-            <a:graphic>
-              <a:graphicData uri="http://schemas.openxmlformats.org/drawingml/2006/picture">
-                <pic:pic>
-                  <pic:nvPicPr>
-                    <pic:cNvPr id="0" name=""/>
-                    <pic:cNvPicPr/>
-                  </pic:nvPicPr>
-                  <pic:blipFill>
-                    <a:blip r:embed="Rba705f924815494d">
-                      <a:extLst>
-                        <a:ext xmlns:a="http://schemas.openxmlformats.org/drawingml/2006/main" uri="{28A0092B-C50C-407E-A947-70E740481C1C}">
-                          <a14:useLocalDpi val="0"/>
-                        </a:ext>
-                      </a:extLst>
-                    </a:blip>
-                    <a:stretch>
-                      <a:fillRect/>
-                    </a:stretch>
-                  </pic:blipFill>
-                  <pic:spPr>
-                    <a:xfrm>
-                      <a:off x="0" y="0"/>
-                      <a:ext cx="5715000" cy="2590800"/>
-                    </a:xfrm>
-                    <a:prstGeom prst="rect">
-                      <a:avLst/>
-                    </a:prstGeom>
-                  </pic:spPr>
-                </pic:pic>
-              </a:graphicData>
-            </a:graphic>
-          </wp:inline>
-        </w:drawing>
       </w:r>
       <w:r>
         <w:br/>
@@ -10865,90 +10338,10 @@
         <w:br/>
       </w:r>
       <w:r>
-        <w:drawing>
-          <wp:inline wp14:editId="5A228D06" wp14:anchorId="7A72B20E">
-            <wp:extent cx="2714625" cy="4000500"/>
-            <wp:effectExtent l="0" t="0" r="0" b="0"/>
-            <wp:docPr id="166556593" name="" title=""/>
-            <wp:cNvGraphicFramePr>
-              <a:graphicFrameLocks noChangeAspect="1"/>
-            </wp:cNvGraphicFramePr>
-            <a:graphic>
-              <a:graphicData uri="http://schemas.openxmlformats.org/drawingml/2006/picture">
-                <pic:pic>
-                  <pic:nvPicPr>
-                    <pic:cNvPr id="0" name=""/>
-                    <pic:cNvPicPr/>
-                  </pic:nvPicPr>
-                  <pic:blipFill>
-                    <a:blip r:embed="R3f832f01c533433f">
-                      <a:extLst>
-                        <a:ext xmlns:a="http://schemas.openxmlformats.org/drawingml/2006/main" uri="{28A0092B-C50C-407E-A947-70E740481C1C}">
-                          <a14:useLocalDpi val="0"/>
-                        </a:ext>
-                      </a:extLst>
-                    </a:blip>
-                    <a:stretch>
-                      <a:fillRect/>
-                    </a:stretch>
-                  </pic:blipFill>
-                  <pic:spPr>
-                    <a:xfrm>
-                      <a:off x="0" y="0"/>
-                      <a:ext cx="2714625" cy="4000500"/>
-                    </a:xfrm>
-                    <a:prstGeom prst="rect">
-                      <a:avLst/>
-                    </a:prstGeom>
-                  </pic:spPr>
-                </pic:pic>
-              </a:graphicData>
-            </a:graphic>
-          </wp:inline>
-        </w:drawing>
+        <w:br/>
       </w:r>
       <w:r>
-        <w:drawing>
-          <wp:inline wp14:editId="1CC94109" wp14:anchorId="19DF38A1">
-            <wp:extent cx="2324100" cy="3990975"/>
-            <wp:effectExtent l="0" t="0" r="0" b="0"/>
-            <wp:docPr id="2111518514" name="" title=""/>
-            <wp:cNvGraphicFramePr>
-              <a:graphicFrameLocks noChangeAspect="1"/>
-            </wp:cNvGraphicFramePr>
-            <a:graphic>
-              <a:graphicData uri="http://schemas.openxmlformats.org/drawingml/2006/picture">
-                <pic:pic>
-                  <pic:nvPicPr>
-                    <pic:cNvPr id="0" name=""/>
-                    <pic:cNvPicPr/>
-                  </pic:nvPicPr>
-                  <pic:blipFill>
-                    <a:blip r:embed="R429f177bec244638">
-                      <a:extLst>
-                        <a:ext xmlns:a="http://schemas.openxmlformats.org/drawingml/2006/main" uri="{28A0092B-C50C-407E-A947-70E740481C1C}">
-                          <a14:useLocalDpi val="0"/>
-                        </a:ext>
-                      </a:extLst>
-                    </a:blip>
-                    <a:stretch>
-                      <a:fillRect/>
-                    </a:stretch>
-                  </pic:blipFill>
-                  <pic:spPr>
-                    <a:xfrm>
-                      <a:off x="0" y="0"/>
-                      <a:ext cx="2324100" cy="3990975"/>
-                    </a:xfrm>
-                    <a:prstGeom prst="rect">
-                      <a:avLst/>
-                    </a:prstGeom>
-                  </pic:spPr>
-                </pic:pic>
-              </a:graphicData>
-            </a:graphic>
-          </wp:inline>
-        </w:drawing>
+        <w:br/>
       </w:r>
       <w:r>
         <w:br/>
@@ -12576,179 +11969,7 @@
         <w:br/>
       </w:r>
       <w:r>
-        <w:drawing>
-          <wp:inline wp14:editId="7A2D50D1" wp14:anchorId="49710EE2">
-            <wp:extent cx="3400425" cy="2311951"/>
-            <wp:effectExtent l="0" t="0" r="0" b="0"/>
-            <wp:docPr id="1389266615" name="" descr="Controle ActiveX" title=""/>
-            <wp:cNvGraphicFramePr>
-              <a:graphicFrameLocks noChangeAspect="1"/>
-            </wp:cNvGraphicFramePr>
-            <a:graphic>
-              <a:graphicData uri="http://schemas.openxmlformats.org/drawingml/2006/picture">
-                <pic:pic>
-                  <pic:nvPicPr>
-                    <pic:cNvPr id="0" name=""/>
-                    <pic:cNvPicPr/>
-                  </pic:nvPicPr>
-                  <pic:blipFill>
-                    <a:blip r:embed="Rd29dd3ec6a00462b">
-                      <a:extLst>
-                        <a:ext xmlns:a="http://schemas.openxmlformats.org/drawingml/2006/main" uri="{28A0092B-C50C-407E-A947-70E740481C1C}">
-                          <a14:useLocalDpi val="0"/>
-                        </a:ext>
-                      </a:extLst>
-                    </a:blip>
-                    <a:stretch>
-                      <a:fillRect/>
-                    </a:stretch>
-                  </pic:blipFill>
-                  <pic:spPr>
-                    <a:xfrm>
-                      <a:off x="0" y="0"/>
-                      <a:ext cx="3400425" cy="2311951"/>
-                    </a:xfrm>
-                    <a:prstGeom prst="rect">
-                      <a:avLst/>
-                    </a:prstGeom>
-                  </pic:spPr>
-                </pic:pic>
-              </a:graphicData>
-            </a:graphic>
-          </wp:inline>
-        </w:drawing>
-      </w:r>
-      <w:r>
-        <w:drawing>
-          <wp:inline wp14:editId="749F11FF" wp14:anchorId="416A4485">
-            <wp:extent cx="4042833" cy="1819275"/>
-            <wp:effectExtent l="0" t="0" r="0" b="0"/>
-            <wp:docPr id="713647422" name="" descr="Picture 1912927965, Imagem" title=""/>
-            <wp:cNvGraphicFramePr>
-              <a:graphicFrameLocks noChangeAspect="1"/>
-            </wp:cNvGraphicFramePr>
-            <a:graphic>
-              <a:graphicData uri="http://schemas.openxmlformats.org/drawingml/2006/picture">
-                <pic:pic>
-                  <pic:nvPicPr>
-                    <pic:cNvPr id="0" name=""/>
-                    <pic:cNvPicPr/>
-                  </pic:nvPicPr>
-                  <pic:blipFill>
-                    <a:blip r:embed="R9f70b474bbe649be">
-                      <a:extLst>
-                        <a:ext xmlns:a="http://schemas.openxmlformats.org/drawingml/2006/main" uri="{28A0092B-C50C-407E-A947-70E740481C1C}">
-                          <a14:useLocalDpi val="0"/>
-                        </a:ext>
-                      </a:extLst>
-                    </a:blip>
-                    <a:stretch>
-                      <a:fillRect/>
-                    </a:stretch>
-                  </pic:blipFill>
-                  <pic:spPr>
-                    <a:xfrm>
-                      <a:off x="0" y="0"/>
-                      <a:ext cx="4042833" cy="1819275"/>
-                    </a:xfrm>
-                    <a:prstGeom prst="rect">
-                      <a:avLst/>
-                    </a:prstGeom>
-                  </pic:spPr>
-                </pic:pic>
-              </a:graphicData>
-            </a:graphic>
-          </wp:inline>
-        </w:drawing>
-      </w:r>
-      <w:r>
         <w:br/>
-      </w:r>
-      <w:r>
-        <w:drawing>
-          <wp:inline wp14:editId="1CFD892F" wp14:anchorId="511DEF07">
-            <wp:extent cx="2863663" cy="1695450"/>
-            <wp:effectExtent l="0" t="0" r="0" b="0"/>
-            <wp:docPr id="310459347" name="" descr="Picture 813652790, Imagem" title=""/>
-            <wp:cNvGraphicFramePr>
-              <a:graphicFrameLocks noChangeAspect="1"/>
-            </wp:cNvGraphicFramePr>
-            <a:graphic>
-              <a:graphicData uri="http://schemas.openxmlformats.org/drawingml/2006/picture">
-                <pic:pic>
-                  <pic:nvPicPr>
-                    <pic:cNvPr id="0" name=""/>
-                    <pic:cNvPicPr/>
-                  </pic:nvPicPr>
-                  <pic:blipFill>
-                    <a:blip r:embed="R4919a11af63a4b37">
-                      <a:extLst>
-                        <a:ext xmlns:a="http://schemas.openxmlformats.org/drawingml/2006/main" uri="{28A0092B-C50C-407E-A947-70E740481C1C}">
-                          <a14:useLocalDpi val="0"/>
-                        </a:ext>
-                      </a:extLst>
-                    </a:blip>
-                    <a:stretch>
-                      <a:fillRect/>
-                    </a:stretch>
-                  </pic:blipFill>
-                  <pic:spPr>
-                    <a:xfrm>
-                      <a:off x="0" y="0"/>
-                      <a:ext cx="2863663" cy="1695450"/>
-                    </a:xfrm>
-                    <a:prstGeom prst="rect">
-                      <a:avLst/>
-                    </a:prstGeom>
-                  </pic:spPr>
-                </pic:pic>
-              </a:graphicData>
-            </a:graphic>
-          </wp:inline>
-        </w:drawing>
-      </w:r>
-      <w:r>
-        <w:drawing>
-          <wp:inline wp14:editId="34D7DA47" wp14:anchorId="4ACF9636">
-            <wp:extent cx="3810000" cy="1727200"/>
-            <wp:effectExtent l="0" t="0" r="0" b="0"/>
-            <wp:docPr id="1992721284" name="" descr="Picture 1861473364, Imagem" title=""/>
-            <wp:cNvGraphicFramePr>
-              <a:graphicFrameLocks noChangeAspect="1"/>
-            </wp:cNvGraphicFramePr>
-            <a:graphic>
-              <a:graphicData uri="http://schemas.openxmlformats.org/drawingml/2006/picture">
-                <pic:pic>
-                  <pic:nvPicPr>
-                    <pic:cNvPr id="0" name=""/>
-                    <pic:cNvPicPr/>
-                  </pic:nvPicPr>
-                  <pic:blipFill>
-                    <a:blip r:embed="R1e434ec4b0d042b7">
-                      <a:extLst>
-                        <a:ext xmlns:a="http://schemas.openxmlformats.org/drawingml/2006/main" uri="{28A0092B-C50C-407E-A947-70E740481C1C}">
-                          <a14:useLocalDpi val="0"/>
-                        </a:ext>
-                      </a:extLst>
-                    </a:blip>
-                    <a:stretch>
-                      <a:fillRect/>
-                    </a:stretch>
-                  </pic:blipFill>
-                  <pic:spPr>
-                    <a:xfrm>
-                      <a:off x="0" y="0"/>
-                      <a:ext cx="3810000" cy="1727200"/>
-                    </a:xfrm>
-                    <a:prstGeom prst="rect">
-                      <a:avLst/>
-                    </a:prstGeom>
-                  </pic:spPr>
-                </pic:pic>
-              </a:graphicData>
-            </a:graphic>
-          </wp:inline>
-        </w:drawing>
       </w:r>
       <w:r>
         <w:br/>
@@ -12760,7 +11981,7 @@
         <w:drawing>
           <wp:inline>
             <wp:extent cx="2103120" cy="4551367"/>
-            <wp:docPr id="2127632299" name="Picture 2127632299"/>
+            <wp:docPr id="7" name="Picture 7"/>
             <wp:cNvGraphicFramePr>
               <a:graphicFrameLocks noChangeAspect="1"/>
             </wp:cNvGraphicFramePr>
@@ -14345,49 +13566,6 @@
         <w:br/>
       </w:r>
       <w:r>
-        <w:drawing>
-          <wp:inline wp14:editId="7DF17360" wp14:anchorId="3DAB7AC4">
-            <wp:extent cx="3533775" cy="2390775"/>
-            <wp:effectExtent l="0" t="0" r="0" b="0"/>
-            <wp:docPr id="885950029" name="" title=""/>
-            <wp:cNvGraphicFramePr>
-              <a:graphicFrameLocks noChangeAspect="1"/>
-            </wp:cNvGraphicFramePr>
-            <a:graphic>
-              <a:graphicData uri="http://schemas.openxmlformats.org/drawingml/2006/picture">
-                <pic:pic>
-                  <pic:nvPicPr>
-                    <pic:cNvPr id="0" name=""/>
-                    <pic:cNvPicPr/>
-                  </pic:nvPicPr>
-                  <pic:blipFill>
-                    <a:blip r:embed="R638f963d28684ecb">
-                      <a:extLst>
-                        <a:ext xmlns:a="http://schemas.openxmlformats.org/drawingml/2006/main" uri="{28A0092B-C50C-407E-A947-70E740481C1C}">
-                          <a14:useLocalDpi val="0"/>
-                        </a:ext>
-                      </a:extLst>
-                    </a:blip>
-                    <a:stretch>
-                      <a:fillRect/>
-                    </a:stretch>
-                  </pic:blipFill>
-                  <pic:spPr>
-                    <a:xfrm>
-                      <a:off x="0" y="0"/>
-                      <a:ext cx="3533775" cy="2390775"/>
-                    </a:xfrm>
-                    <a:prstGeom prst="rect">
-                      <a:avLst/>
-                    </a:prstGeom>
-                  </pic:spPr>
-                </pic:pic>
-              </a:graphicData>
-            </a:graphic>
-          </wp:inline>
-        </w:drawing>
-      </w:r>
-      <w:r>
         <w:br/>
       </w:r>
       <w:r>
@@ -14400,7 +13578,7 @@
         <w:drawing>
           <wp:inline>
             <wp:extent cx="2103120" cy="4551367"/>
-            <wp:docPr id="2127632300" name="Picture 2127632300"/>
+            <wp:docPr id="8" name="Picture 8"/>
             <wp:cNvGraphicFramePr>
               <a:graphicFrameLocks noChangeAspect="1"/>
             </wp:cNvGraphicFramePr>
@@ -16008,7 +15186,6 @@
       <w:pPr>
         <w:spacing w:line="360" w:lineRule="auto"/>
         <w:ind w:left="0"/>
-        <w:jc w:val="left"/>
         <w:rPr>
           <w:rFonts w:ascii="Times New Roman" w:hAnsi="Times New Roman" w:eastAsia="Times New Roman" w:cs="Times New Roman"/>
           <w:b w:val="0"/>
@@ -16048,7 +15225,7 @@
         <w:drawing>
           <wp:inline>
             <wp:extent cx="2103120" cy="4551367"/>
-            <wp:docPr id="2127632301" name="Picture 2127632301"/>
+            <wp:docPr id="9" name="Picture 9"/>
             <wp:cNvGraphicFramePr>
               <a:graphicFrameLocks noChangeAspect="1"/>
             </wp:cNvGraphicFramePr>
@@ -16086,49 +15263,6 @@
         <w:jc w:val="left"/>
       </w:pPr>
       <w:r>
-        <w:drawing>
-          <wp:inline wp14:editId="41B7FEEB" wp14:anchorId="487ACFCA">
-            <wp:extent cx="5715000" cy="2562225"/>
-            <wp:effectExtent l="0" t="0" r="0" b="0"/>
-            <wp:docPr id="753541771" name="" title=""/>
-            <wp:cNvGraphicFramePr>
-              <a:graphicFrameLocks noChangeAspect="1"/>
-            </wp:cNvGraphicFramePr>
-            <a:graphic>
-              <a:graphicData uri="http://schemas.openxmlformats.org/drawingml/2006/picture">
-                <pic:pic>
-                  <pic:nvPicPr>
-                    <pic:cNvPr id="0" name=""/>
-                    <pic:cNvPicPr/>
-                  </pic:nvPicPr>
-                  <pic:blipFill>
-                    <a:blip r:embed="Re95cd1483abd4401">
-                      <a:extLst>
-                        <a:ext xmlns:a="http://schemas.openxmlformats.org/drawingml/2006/main" uri="{28A0092B-C50C-407E-A947-70E740481C1C}">
-                          <a14:useLocalDpi val="0"/>
-                        </a:ext>
-                      </a:extLst>
-                    </a:blip>
-                    <a:stretch>
-                      <a:fillRect/>
-                    </a:stretch>
-                  </pic:blipFill>
-                  <pic:spPr>
-                    <a:xfrm>
-                      <a:off x="0" y="0"/>
-                      <a:ext cx="5715000" cy="2562225"/>
-                    </a:xfrm>
-                    <a:prstGeom prst="rect">
-                      <a:avLst/>
-                    </a:prstGeom>
-                  </pic:spPr>
-                </pic:pic>
-              </a:graphicData>
-            </a:graphic>
-          </wp:inline>
-        </w:drawing>
-      </w:r>
-      <w:r>
         <w:br/>
       </w:r>
     </w:p>
@@ -17758,7 +16892,7 @@
         <w:drawing>
           <wp:inline>
             <wp:extent cx="2103120" cy="4551367"/>
-            <wp:docPr id="2127632302" name="Picture 2127632302"/>
+            <wp:docPr id="10" name="Picture 10"/>
             <wp:cNvGraphicFramePr>
               <a:graphicFrameLocks noChangeAspect="1"/>
             </wp:cNvGraphicFramePr>

</xml_diff>